<commit_message>
Refine report and docs framing; add demo run screenshot
</commit_message>
<xml_diff>
--- a/smart-home-honeynet/docs/report/SmartHoneyNet-IEEE.docx
+++ b/smart-home-honeynet/docs/report/SmartHoneyNet-IEEE.docx
@@ -26,7 +26,7 @@
           <w:i/>
           <w:sz w:val="22"/>
         </w:rPr>
-        <w:t>An improved and reproducible re-engineering of the CCSE graduation project</w:t>
+        <w:t>A reproducible platform for smart-home network security · University of Jeddah (CCSE)</w:t>
       </w:r>
     </w:p>
     <w:p>
@@ -88,7 +88,7 @@
           <w:i/>
           <w:sz w:val="18"/>
         </w:rPr>
-        <w:t>Smart homes are projected to reach roughly 312 million households by 2027, expanding a poorly-defended IoT attack surface that botnets such as Mirai exploit through default credentials and exposed telnet/HTTP interfaces. The original graduation project demonstrated that honeypots, an IDS and the ELK stack can capture such attacks, but was delivered as a manually-provisioned, three-VM lab that showed two attacks qualitatively and could not be reproduced or measured. This paper presents SmartHoneyNet, a complete redesign and rebuild of the same idea as a reproducible, tested and quantitatively evaluated platform. Two low-interaction honeypots emulate a Mirai-style telnet IoT hub and a smart-home device web panel; a hybrid signature-plus-anomaly detection engine classifies six attack categories and maps every alert to MITRE ATT&amp;CK; a pipeline persists all data to both SQLite and Elasticsearch for Kibana visualisation. The platform runs on a single host, ships with a 39-test automated suite and enforced security controls, and on a controlled labelled evaluation set the engine achieves 100% precision and recall with zero false positives on benign traffic.</w:t>
+        <w:t>Smart homes are projected to reach roughly 312 million households by 2027, expanding a poorly-defended IoT attack surface that botnets such as Mirai exploit through default credentials and exposed telnet/HTTP interfaces. This paper presents SmartHoneyNet, a reproducible, tested and quantitatively evaluated platform that combines honeypots, an IDS and the ELK stack to hunt, detect and analyse these attacks on a single host. Two low-interaction honeypots emulate a Mirai-style telnet IoT hub and a smart-home device web panel; a hybrid signature-plus-anomaly detection engine classifies six attack categories and maps every alert to MITRE ATT&amp;CK; a pipeline persists all data to both SQLite and Elasticsearch for Kibana visualisation. The platform runs on a single host, ships with a 39-test automated suite and enforced security controls, and on a controlled labelled evaluation set the engine achieves 100% precision and recall with zero false positives on benign traffic.</w:t>
       </w:r>
     </w:p>
     <w:p>
@@ -244,7 +244,7 @@
           <w:i/>
           <w:sz w:val="20"/>
         </w:rPr>
-        <w:t>C. Contributions over the original project</w:t>
+        <w:t>C. Platform capabilities</w:t>
       </w:r>
     </w:p>
     <w:tbl>
@@ -292,7 +292,7 @@
                 <w:b/>
                 <w:sz w:val="16"/>
               </w:rPr>
-              <w:t>Original project</w:t>
+              <w:t>Capability</w:t>
             </w:r>
           </w:p>
         </w:tc>
@@ -310,7 +310,7 @@
                 <w:b/>
                 <w:sz w:val="16"/>
               </w:rPr>
-              <w:t>This work</w:t>
+              <w:t>What it delivers</w:t>
             </w:r>
           </w:p>
         </w:tc>
@@ -340,7 +340,7 @@
               <w:rPr>
                 <w:sz w:val="16"/>
               </w:rPr>
-              <w:t>3 manual VirtualBox VMs</w:t>
+              <w:t>Deployment</w:t>
             </w:r>
           </w:p>
         </w:tc>
@@ -384,7 +384,7 @@
               <w:rPr>
                 <w:sz w:val="16"/>
               </w:rPr>
-              <w:t>2 attacks via screenshots</w:t>
+              <w:t>Detection coverage</w:t>
             </w:r>
           </w:p>
         </w:tc>
@@ -428,7 +428,7 @@
               <w:rPr>
                 <w:sz w:val="16"/>
               </w:rPr>
-              <w:t>Qualitative results only</w:t>
+              <w:t>Evaluation</w:t>
             </w:r>
           </w:p>
         </w:tc>
@@ -472,7 +472,7 @@
               <w:rPr>
                 <w:sz w:val="16"/>
               </w:rPr>
-              <w:t>Snort signatures only</w:t>
+              <w:t>Detection engine</w:t>
             </w:r>
           </w:p>
         </w:tc>
@@ -486,7 +486,7 @@
               <w:rPr>
                 <w:sz w:val="16"/>
               </w:rPr>
-              <w:t>Hybrid signature + anomaly engine</w:t>
+              <w:t>Hybrid signature + anomaly</w:t>
             </w:r>
           </w:p>
         </w:tc>
@@ -516,7 +516,7 @@
               <w:rPr>
                 <w:sz w:val="16"/>
               </w:rPr>
-              <w:t>No attack taxonomy</w:t>
+              <w:t>Threat taxonomy</w:t>
             </w:r>
           </w:p>
         </w:tc>
@@ -560,7 +560,7 @@
               <w:rPr>
                 <w:sz w:val="16"/>
               </w:rPr>
-              <w:t>No automated testing</w:t>
+              <w:t>Quality</w:t>
             </w:r>
           </w:p>
         </w:tc>
@@ -604,7 +604,7 @@
               <w:rPr>
                 <w:sz w:val="16"/>
               </w:rPr>
-              <w:t>Unbounded DoS script</w:t>
+              <w:t>Safe tooling</w:t>
             </w:r>
           </w:p>
         </w:tc>
@@ -648,7 +648,7 @@
               <w:rPr>
                 <w:sz w:val="16"/>
               </w:rPr>
-              <w:t>No threat model</w:t>
+              <w:t>Security</w:t>
             </w:r>
           </w:p>
         </w:tc>
@@ -678,7 +678,7 @@
           <w:i/>
           <w:sz w:val="16"/>
         </w:rPr>
-        <w:t>TABLE I. Contributions over the original project.</w:t>
+        <w:t>TABLE I. Platform capabilities at a glance.</w:t>
       </w:r>
     </w:p>
     <w:p>
@@ -1389,7 +1389,7 @@
           <w:i w:val="0"/>
           <w:sz w:val="20"/>
         </w:rPr>
-        <w:t>The project follows the original three-stage flow, re-expressed as software: (1) attack generation—by real attackers or the safety-gated simulators; (2) detection and collection—honeypots capture each interaction as a structured event that the pipeline persists and runs through the IDS; (3) transformation and analysis—events and alerts are stored in SQLite and shipped through Logstash into Elasticsearch for Kibana, with an analyzer producing Markdown/JSON reports.</w:t>
+        <w:t>The platform follows a three-stage flow, expressed as software: (1) attack generation—by real attackers or the safety-gated simulators; (2) detection and collection—honeypots capture each interaction as a structured event that the pipeline persists and runs through the IDS; (3) transformation and analysis—events and alerts are stored in SQLite and shipped through Logstash into Elasticsearch for Kibana, with an analyzer producing Markdown/JSON reports.</w:t>
       </w:r>
     </w:p>
     <w:p>
@@ -1429,7 +1429,7 @@
           <w:i w:val="0"/>
           <w:sz w:val="20"/>
         </w:rPr>
-        <w:t>The platform is a pipeline of composable components. The original three VMs map onto software: the attacker VM becomes the attack simulators, the honeypot VM (Cowrie/Pentbox) becomes the telnet and HTTP honeypots, and the IDS+ELK VM (Snort+ELK) becomes the detection engine (with an equivalent Suricata rule file) plus the ELK services.</w:t>
+        <w:t>The platform is a pipeline of composable components that replace a traditional multi-VM lab with software: the attack simulators generate adversary traffic, the telnet and HTTP honeypots act as the sensors, and the detection engine (with an equivalent Suricata rule file) plus the ELK services perform detection and analysis.</w:t>
       </w:r>
     </w:p>
     <w:p>
@@ -2061,7 +2061,7 @@
           <w:i w:val="0"/>
           <w:sz w:val="20"/>
         </w:rPr>
-        <w:t>—port scan, brute-force and a bounded HTTP flood (a safe re-implementation of the original’s unbounded loop), each gated by the safety module.</w:t>
+        <w:t>—port scan, brute-force and a bounded, safety-gated HTTP flood, each checked by the safety module before any packet is sent.</w:t>
       </w:r>
     </w:p>
     <w:p>
@@ -2125,7 +2125,7 @@
           <w:i w:val="0"/>
           <w:sz w:val="20"/>
         </w:rPr>
-        <w:t>The demo command starts both honeypots on ephemeral ports and launches a port scan, a telnet brute-force, an HTTP flood and web-exploitation probes against them. A representative run captured ~196 events and raised alerts in all five exercised categories—reproducing and extending, from two to six attack types, the original demonstration as a single command.</w:t>
+        <w:t>The demo command starts both honeypots on ephemeral ports and launches a port scan, a telnet brute-force, an HTTP flood and web-exploitation probes against them. A representative run captured ~196 events and raised alerts in all five exercised categories—covering six attack types end to end, as a single reproducible command.</w:t>
       </w:r>
     </w:p>
     <w:p>
@@ -2676,7 +2676,7 @@
           <w:i w:val="0"/>
           <w:sz w:val="20"/>
         </w:rPr>
-        <w:t>The experiments confirm the original hypothesis and strengthen it with measurement. Three findings stand out: (1) default credentials remain the highest-signal indicator—a single login with a Mirai default pair is immediately malicious; (2) hybrid detection is complementary, not redundant—signatures catch the known while rate rules catch behaviour that has no fixed signature; and (3) the captured credential intelligence has direct defensive value, yielding a blocklist of passwords a homeowner must never use.</w:t>
+        <w:t>The experiments confirm the central hypothesis and strengthen it with measurement. Three findings stand out: (1) default credentials remain the highest-signal indicator—a single login with a Mirai default pair is immediately malicious; (2) hybrid detection is complementary, not redundant—signatures catch the known while rate rules catch behaviour that has no fixed signature; and (3) the captured credential intelligence has direct defensive value, yielding a blocklist of passwords a homeowner must never use.</w:t>
       </w:r>
     </w:p>
     <w:p>
@@ -2756,7 +2756,7 @@
           <w:i w:val="0"/>
           <w:sz w:val="20"/>
         </w:rPr>
-        <w:t>Future directions include Cowrie/Dionaea integration for higher-interaction capture; an MQTT honeypot (TCP 1883) for the dominant smart-home broker; a virtual IoT-device environment (the original’s Pot2DPI/Honeyd goal); an ML-based anomaly detector evaluated on the same labelled sets; GeoIP and threat-intel enrichment; and automated firewall response for high-severity sources.</w:t>
+        <w:t>Future directions include Cowrie/Dionaea integration for higher-interaction capture; an MQTT honeypot (TCP 1883) for the dominant smart-home broker; a virtual IoT-device environment with realistic device fingerprints; an ML-based anomaly detector evaluated on the same labelled sets; GeoIP and threat-intel enrichment; and automated firewall response for high-severity sources.</w:t>
       </w:r>
     </w:p>
     <w:p>
@@ -2784,7 +2784,7 @@
           <w:i w:val="0"/>
           <w:sz w:val="20"/>
         </w:rPr>
-        <w:t>SmartHoneyNet re-engineers the project from a one-off, three-VM demonstration into a reproducible, tested and measured security platform. It keeps the sound core idea—honeypots to attract, an IDS to detect, ELK to analyse—and adds a hybrid engine covering six attack classes, a MITRE ATT&amp;CK classification of every alert, a real database and dashboards, a 39-test suite with CI, enforced security controls, and a quantitative evaluation showing 100% precision and recall with zero false positives on a controlled labelled set. As smart-home adoption races toward hundreds of millions of households, tools that let defenders hunt attackers safely, reproducibly and measurably are exactly what the field needs.</w:t>
+        <w:t>SmartHoneyNet is a reproducible, tested and measured platform for smart-home network security. It builds on a proven core idea—honeypots to attract, an IDS to detect, ELK to analyse—and adds a hybrid engine covering six attack classes, a MITRE ATT&amp;CK classification of every alert, a real database and dashboards, a 39-test suite with CI, enforced security controls, and a quantitative evaluation showing 100% precision and recall with zero false positives on a controlled labelled set. As smart-home adoption races toward hundreds of millions of households, tools that let defenders hunt attackers safely, reproducibly and measurably are exactly what the field needs.</w:t>
       </w:r>
     </w:p>
     <w:p>

</xml_diff>